<commit_message>
docs: align README and use cases with Walmart meeting agreements
Item #26. README gains the missing domain assumptions (visible facade,
no stacking, single product class, no top storage or aisle islands), a
table of client agreements with date and status, RF06 (batch
evaluation) and clearer RF01/RF04/RF05. Use case templates CU01-CU06 are
updated to match the actual pipeline and the threshold as configurable
free space, and CU07 (evaluate with an image batch) is added.
docs/curso.md lists 8 use cases. New backlog items #27 and #28; #24 gets
the open questions for Walmart.

Co-Authored-By: Claude Opus 5.5 <noreply@anthropic.com>
</commit_message>
<xml_diff>
--- a/Anexos/Diseño/Plantilla de C.U 01.docx
+++ b/Anexos/Diseño/Plantilla de C.U 01.docx
@@ -427,7 +427,7 @@
                 <w:color w:val="1f1f1f"/>
                 <w:rtl w:val="0"/>
               </w:rPr>
-              <w:t xml:space="preserve">El sistema recibe una captura fotográfica estática de la góndola de alimentos no perecibles, aplica filtros de preprocesamiento para mitigar el ruido visual y calcula el espacio disponible (medición por nivel o evaluación de umbral).</w:t>
+              <w:t xml:space="preserve">El sistema recibe una fotografía estática de una góndola de alimentos no perecibles (frontal, en ángulo o desde arriba), corrige la imagen, segmenta automáticamente la góndola y sus repisas, detecta los productos y calcula el espacio libre por repisa (Nivel 1) y la alerta por umbral de la góndola (Nivel 2).</w:t>
             </w:r>
             <w:r>
               <w:rPr>
@@ -523,7 +523,7 @@
                 <w:color w:val="1f1f1f"/>
                 <w:rtl w:val="0"/>
               </w:rPr>
-              <w:t xml:space="preserve">La cámara IP/seguridad de la sala está activa y asociada a una góndola específica.</w:t>
+              <w:t xml:space="preserve">Llega una imagen desde una cámara de sala o desde un lote de fotos. No se exige que cada cámara vea una sola góndola: el sistema la segmenta en cada imagen.</w:t>
             </w:r>
           </w:p>
           <w:p>
@@ -686,7 +686,7 @@
                 <w:color w:val="1f1f1f"/>
                 <w:rtl w:val="0"/>
               </w:rPr>
-              <w:t xml:space="preserve">El módulo de preprocesamiento aplica normalización de iluminación y corrección de contraste.</w:t>
+              <w:t xml:space="preserve">El módulo de preprocesamiento corrige la distorsión de lente y el contraste (CLAHE) y segmenta automáticamente la góndola y sus repisas.</w:t>
             </w:r>
           </w:p>
           <w:p>
@@ -707,7 +707,7 @@
                 <w:color w:val="1f1f1f"/>
                 <w:rtl w:val="0"/>
               </w:rPr>
-              <w:t xml:space="preserve">El modelo base (YOLOv8 / algoritmos de visión clásica) detecta los límites del estante y las zonas vacías.</w:t>
+              <w:t xml:space="preserve">El detector YOLO26 detecta los productos de la góndola (una sola clase: basta saber si hay producto). La bodega superior y las islas del pasillo no se miden.</w:t>
             </w:r>
           </w:p>
           <w:p>
@@ -728,7 +728,7 @@
                 <w:color w:val="1f1f1f"/>
                 <w:rtl w:val="0"/>
               </w:rPr>
-              <w:t xml:space="preserve">El módulo de postprocesamiento evalúa si el espacio disponible es inferior al umbral del 30% o calcula el porcentaje exacto por nivel.</w:t>
+              <w:t xml:space="preserve">El módulo de postprocesamiento calcula el espacio libre de cada repisa y de la góndola, y evalúa si el espacio libre alcanza el umbral configurado (30% del frente por defecto).</w:t>
             </w:r>
           </w:p>
           <w:p>
@@ -749,7 +749,7 @@
                 <w:color w:val="1f1f1f"/>
                 <w:rtl w:val="0"/>
               </w:rPr>
-              <w:t xml:space="preserve">El sistema registra las métricas calculadas en la base de datos de metadatos.</w:t>
+              <w:t xml:space="preserve">El sistema registra el resultado (% libre por góndola y por repisa, alerta sí/no) para las alertas (CU02) y los reportes (CU04).</w:t>
             </w:r>
           </w:p>
         </w:tc>
@@ -846,7 +846,7 @@
                 <w:color w:val="1f1f1f"/>
                 <w:rtl w:val="0"/>
               </w:rPr>
-              <w:t xml:space="preserve">La métrica de disponibilidad de la góndola queda actualizada en la base de datos.</w:t>
+              <w:t xml:space="preserve">El espacio libre de la góndola y de cada repisa queda registrado.</w:t>
             </w:r>
             <w:r>
               <w:rPr>
@@ -959,6 +959,90 @@
                 <w:rtl w:val="0"/>
               </w:rPr>
               <w:t xml:space="preserve">: Si la imagen presenta oclusión total o fallo de transmisión, el sistema registra un log de advertencia y solicita el reenvío de la siguiente captura sin detener el servicio.</w:t>
+            </w:r>
+            <w:r>
+              <w:rPr>
+                <w:rtl w:val="0"/>
+              </w:rPr>
+              <w:t xml:space="preserve"> </w:t>
+            </w:r>
+          </w:p>
+          <w:p>
+            <w:pPr>
+              <w:keepNext w:val="0"/>
+              <w:keepLines w:val="0"/>
+              <w:pageBreakBefore w:val="0"/>
+              <w:widowControl w:val="0"/>
+              <w:pBdr>
+                <w:top w:space="0" w:sz="0" w:val="nil"/>
+                <w:left w:space="0" w:sz="0" w:val="nil"/>
+                <w:bottom w:space="0" w:sz="0" w:val="nil"/>
+                <w:right w:space="0" w:sz="0" w:val="nil"/>
+                <w:between w:space="0" w:sz="0" w:val="nil"/>
+              </w:pBdr>
+              <w:shd w:fill="auto" w:val="clear"/>
+              <w:spacing w:after="0" w:before="0" w:line="240" w:lineRule="auto"/>
+              <w:ind w:left="0" w:right="0" w:firstLine="0"/>
+              <w:jc w:val="left"/>
+              <w:rPr/>
+            </w:pPr>
+            <w:r>
+              <w:rPr>
+                <w:b w:val="1"/>
+                <w:bCs w:val="1"/>
+                <w:color w:val="1f1f1f"/>
+                <w:rtl w:val="0"/>
+              </w:rPr>
+              <w:t xml:space="preserve">Excepción 2a (Góndola no encontrada)</w:t>
+            </w:r>
+            <w:r>
+              <w:rPr>
+                <w:color w:val="1f1f1f"/>
+                <w:rtl w:val="0"/>
+              </w:rPr>
+              <w:t xml:space="preserve">: Si no se detectan repisas, el sistema analiza la imagen completa como un solo nivel y marca el resultado como análisis global.</w:t>
+            </w:r>
+            <w:r>
+              <w:rPr>
+                <w:rtl w:val="0"/>
+              </w:rPr>
+              <w:t xml:space="preserve"> </w:t>
+            </w:r>
+          </w:p>
+          <w:p>
+            <w:pPr>
+              <w:keepNext w:val="0"/>
+              <w:keepLines w:val="0"/>
+              <w:pageBreakBefore w:val="0"/>
+              <w:widowControl w:val="0"/>
+              <w:pBdr>
+                <w:top w:space="0" w:sz="0" w:val="nil"/>
+                <w:left w:space="0" w:sz="0" w:val="nil"/>
+                <w:bottom w:space="0" w:sz="0" w:val="nil"/>
+                <w:right w:space="0" w:sz="0" w:val="nil"/>
+                <w:between w:space="0" w:sz="0" w:val="nil"/>
+              </w:pBdr>
+              <w:shd w:fill="auto" w:val="clear"/>
+              <w:spacing w:after="0" w:before="0" w:line="240" w:lineRule="auto"/>
+              <w:ind w:left="0" w:right="0" w:firstLine="0"/>
+              <w:jc w:val="left"/>
+              <w:rPr/>
+            </w:pPr>
+            <w:r>
+              <w:rPr>
+                <w:b w:val="1"/>
+                <w:bCs w:val="1"/>
+                <w:color w:val="1f1f1f"/>
+                <w:rtl w:val="0"/>
+              </w:rPr>
+              <w:t xml:space="preserve">Excepción 1a (Cámara defectuosa)</w:t>
+            </w:r>
+            <w:r>
+              <w:rPr>
+                <w:color w:val="1f1f1f"/>
+                <w:rtl w:val="0"/>
+              </w:rPr>
+              <w:t xml:space="preserve">: Si la imagen tiene colores imposibles (por ejemplo, toda verde o violeta), el sistema no la analiza y registra una alerta de cámara para revisión.</w:t>
             </w:r>
             <w:r>
               <w:rPr>

</xml_diff>

<commit_message>
docs: add web app photo upload to CU01 (#42)
</commit_message>
<xml_diff>
--- a/Anexos/Diseño/Plantilla de C.U 01.docx
+++ b/Anexos/Diseño/Plantilla de C.U 01.docx
@@ -523,7 +523,7 @@
                 <w:color w:val="1f1f1f"/>
                 <w:rtl w:val="0"/>
               </w:rPr>
-              <w:t xml:space="preserve">Llega una imagen desde una cámara de sala o desde un lote de fotos. No se exige que cada cámara vea una sola góndola: el sistema la segmenta en cada imagen.</w:t>
+              <w:t xml:space="preserve">Llega una imagen desde una cámara de sala, desde un lote de fotos o desde la app web, donde el Administrador o el Jefe de Salón la sube en la página "Análisis" indicando el pasillo y la góndola. No se exige que cada cámara vea una sola góndola: el sistema la segmenta en cada imagen.</w:t>
             </w:r>
           </w:p>
           <w:p>
@@ -749,7 +749,7 @@
                 <w:color w:val="1f1f1f"/>
                 <w:rtl w:val="0"/>
               </w:rPr>
-              <w:t xml:space="preserve">El sistema registra el resultado de la góndola (% libre, alerta sí/no y la imagen con los huecos marcados) para las alertas (CU02) y los reportes (CU04).</w:t>
+              <w:t xml:space="preserve">El sistema registra el resultado de la góndola (% libre, alerta sí/no, la imagen con los huecos marcados y quién la subió) para las alertas (CU02) y los reportes (CU04). Las fotos solo se ven con sesión iniciada.</w:t>
             </w:r>
           </w:p>
         </w:tc>

</xml_diff>